<commit_message>
Títulos y subtítulos en negro en todos los PDF y Word
- reporte.py: encabezados, subtítulo de portada y subtítulos menores en negro
  (antes azul petróleo y gris)
- cuaderno.py: títulos de los notebooks y sus líneas inferiores en negro
- word.py: plantillas de Word con títulos y subtítulos en negro
- PDF, Word y zip de las 18 actividades generadas por código regenerados sin
  volver a ejecutar notebooks ni experimentos (la actividad 02 es un PDF hecho
  en Word y no se modificó)

Co-Authored-By: Claude Opus 5.5 <noreply@anthropic.com>
</commit_message>
<xml_diff>
--- a/actividades/03-relaciona-photoshop-mejoramiento/Photoshop_Mejoramiento_de_imagenes.docx
+++ b/actividades/03-relaciona-photoshop-mejoramiento/Photoshop_Mejoramiento_de_imagenes.docx
@@ -2931,7 +2931,7 @@
       <w:rFonts w:ascii="Aptos" w:hAnsi="Aptos"/>
       <w:b w:val="0"/>
       <w:i w:val="0"/>
-      <w:color w:val="595959"/>
+      <w:color w:val="000000"/>
       <w:sz w:val="28"/>
       <w:szCs w:val="30"/>
       <w:spacing w:val="20"/>
@@ -3020,7 +3020,7 @@
       <w:b w:val="0"/>
       <w:bCs/>
       <w:i w:val="0"/>
-      <w:color w:val="0F4761"/>
+      <w:color w:val="000000"/>
       <w:sz w:val="34"/>
       <w:szCs w:val="28"/>
     </w:rPr>
@@ -3043,7 +3043,7 @@
       <w:b w:val="0"/>
       <w:bCs/>
       <w:i w:val="0"/>
-      <w:color w:val="0F4761"/>
+      <w:color w:val="000000"/>
       <w:sz w:val="27"/>
       <w:szCs w:val="24"/>
     </w:rPr>
@@ -3066,7 +3066,7 @@
       <w:i w:val="0"/>
       <w:b w:val="0"/>
       <w:bCs/>
-      <w:color w:val="595959"/>
+      <w:color w:val="000000"/>
       <w:sz w:val="24"/>
       <w:szCs w:val="24"/>
       <w:spacing w:val="20"/>

</xml_diff>